<commit_message>
Agrega datos de la UTP (Facultad de Salud, Enfermería) y al integrante Luis Valencia Rangel
Co-Authored-By: Claude Opus 5.5 <noreply@anthropic.com>
Claude-Session: https://claude.ai/code/session_01YPrGTKfiHQAfRjsuiqCpfL
</commit_message>
<xml_diff>
--- a/monografia-vision-audicion/Monografia_Desarrollo_Vision_Audicion.docx
+++ b/monografia-vision-audicion/Monografia_Desarrollo_Vision_Audicion.docx
@@ -13,11 +13,39 @@
           <w:i w:val="0"/>
           <w:sz w:val="32"/>
         </w:rPr>
-        <w:t>[NOMBRE DE LA UNIVERSIDAD]</w:t>
+        <w:t>UNIVERSIDAD TECNOLÓGICA DEL PERÚ</w:t>
       </w:r>
     </w:p>
     <w:p>
       <w:pPr>
+        <w:spacing w:after="120"/>
+        <w:jc w:val="center"/>
+      </w:pPr>
+      <w:r>
+        <w:rPr>
+          <w:b/>
+          <w:i w:val="0"/>
+          <w:sz w:val="28"/>
+        </w:rPr>
+        <w:t>(UTP)</w:t>
+      </w:r>
+    </w:p>
+    <w:p>
+      <w:pPr>
+        <w:spacing w:after="0"/>
+        <w:jc w:val="center"/>
+      </w:pPr>
+      <w:r>
+        <w:rPr>
+          <w:b w:val="0"/>
+          <w:i w:val="0"/>
+          <w:sz w:val="26"/>
+        </w:rPr>
+        <w:t>Facultad de Salud</w:t>
+      </w:r>
+    </w:p>
+    <w:p>
+      <w:pPr>
         <w:spacing w:after="480"/>
         <w:jc w:val="center"/>
       </w:pPr>
@@ -27,12 +55,12 @@
           <w:i w:val="0"/>
           <w:sz w:val="26"/>
         </w:rPr>
-        <w:t>[Facultad / Escuela Profesional]</w:t>
+        <w:t>Carrera Profesional de Enfermería</w:t>
       </w:r>
     </w:p>
     <w:p>
       <w:pPr>
-        <w:spacing w:after="720"/>
+        <w:spacing w:after="600"/>
         <w:jc w:val="center"/>
       </w:pPr>
       <w:r>
@@ -41,7 +69,7 @@
           <w:i w:val="0"/>
           <w:sz w:val="22"/>
         </w:rPr>
-        <w:t>[Logo de la universidad]</w:t>
+        <w:t>[Logo de la UTP]</w:t>
       </w:r>
     </w:p>
     <w:p>
@@ -238,6 +266,20 @@
           <w:sz w:val="24"/>
         </w:rPr>
         <w:t>ZARATE ROJAS, Leandra</w:t>
+      </w:r>
+    </w:p>
+    <w:p>
+      <w:pPr>
+        <w:spacing w:after="0"/>
+        <w:jc w:val="center"/>
+      </w:pPr>
+      <w:r>
+        <w:rPr>
+          <w:b w:val="0"/>
+          <w:i w:val="0"/>
+          <w:sz w:val="24"/>
+        </w:rPr>
+        <w:t>VALENCIA RANGEL, Luis</w:t>
       </w:r>
     </w:p>
     <w:p/>

</xml_diff>

<commit_message>
Agrega logo oficial de la UTP y nombre del docente en monografía y presentación
Co-Authored-By: Claude Opus 5.5 <noreply@anthropic.com>
Claude-Session: https://claude.ai/code/session_01YPrGTKfiHQAfRjsuiqCpfL
</commit_message>
<xml_diff>
--- a/monografia-vision-audicion/Monografia_Desarrollo_Vision_Audicion.docx
+++ b/monografia-vision-audicion/Monografia_Desarrollo_Vision_Audicion.docx
@@ -4,6 +4,46 @@
   <w:body>
     <w:p>
       <w:pPr>
+        <w:spacing w:after="360"/>
+        <w:jc w:val="center"/>
+      </w:pPr>
+      <w:r>
+        <w:drawing>
+          <wp:inline xmlns:a="http://schemas.openxmlformats.org/drawingml/2006/main" xmlns:pic="http://schemas.openxmlformats.org/drawingml/2006/picture">
+            <wp:extent cx="3240000" cy="714484"/>
+            <wp:docPr id="1" name="Picture 1"/>
+            <wp:cNvGraphicFramePr>
+              <a:graphicFrameLocks noChangeAspect="1"/>
+            </wp:cNvGraphicFramePr>
+            <a:graphic>
+              <a:graphicData uri="http://schemas.openxmlformats.org/drawingml/2006/picture">
+                <pic:pic>
+                  <pic:nvPicPr>
+                    <pic:cNvPr id="0" name="utp_logo.png"/>
+                    <pic:cNvPicPr/>
+                  </pic:nvPicPr>
+                  <pic:blipFill>
+                    <a:blip r:embed="rId10"/>
+                    <a:stretch>
+                      <a:fillRect/>
+                    </a:stretch>
+                  </pic:blipFill>
+                  <pic:spPr>
+                    <a:xfrm>
+                      <a:off x="0" y="0"/>
+                      <a:ext cx="3240000" cy="714484"/>
+                    </a:xfrm>
+                    <a:prstGeom prst="rect"/>
+                  </pic:spPr>
+                </pic:pic>
+              </a:graphicData>
+            </a:graphic>
+          </wp:inline>
+        </w:drawing>
+      </w:r>
+    </w:p>
+    <w:p>
+      <w:pPr>
         <w:spacing w:after="0"/>
         <w:jc w:val="center"/>
       </w:pPr>
@@ -46,7 +86,7 @@
     </w:p>
     <w:p>
       <w:pPr>
-        <w:spacing w:after="480"/>
+        <w:spacing w:after="600"/>
         <w:jc w:val="center"/>
       </w:pPr>
       <w:r>
@@ -56,20 +96,6 @@
           <w:sz w:val="26"/>
         </w:rPr>
         <w:t>Carrera Profesional de Enfermería</w:t>
-      </w:r>
-    </w:p>
-    <w:p>
-      <w:pPr>
-        <w:spacing w:after="600"/>
-        <w:jc w:val="center"/>
-      </w:pPr>
-      <w:r>
-        <w:rPr>
-          <w:b w:val="0"/>
-          <w:i w:val="0"/>
-          <w:sz w:val="22"/>
-        </w:rPr>
-        <w:t>[Logo de la UTP]</w:t>
       </w:r>
     </w:p>
     <w:p>
@@ -153,7 +179,7 @@
           <w:i w:val="0"/>
           <w:sz w:val="24"/>
         </w:rPr>
-        <w:t>[Nombre del docente]</w:t>
+        <w:t>LLANOS MATALLANA, César José</w:t>
       </w:r>
     </w:p>
     <w:p>

</xml_diff>